<commit_message>
maps pour users , pour fournieurs , dashborad et users pour admin
</commit_message>
<xml_diff>
--- a/details app.docx
+++ b/details app.docx
@@ -2935,6 +2935,1099 @@
         <w:t xml:space="preserve"> Cache + sécurité </w:t>
       </w:r>
     </w:p>
+    <w:p>
+      <w:pPr>
+        <w:pStyle w:val="NormalWeb"/>
+      </w:pPr>
+      <w:r>
+        <w:t xml:space="preserve">Le </w:t>
+      </w:r>
+      <w:r>
+        <w:rPr>
+          <w:rStyle w:val="Strong"/>
+        </w:rPr>
+        <w:t>modèle en V</w:t>
+      </w:r>
+      <w:r>
+        <w:t xml:space="preserve"> (ou </w:t>
+      </w:r>
+      <w:r>
+        <w:rPr>
+          <w:rStyle w:val="Emphasis"/>
+        </w:rPr>
+        <w:t>V-Model</w:t>
+      </w:r>
+      <w:r>
+        <w:t xml:space="preserve">) est une méthode de gestion de projet, surtout utilisée en développement logiciel. Il sert à organiser les étapes du projet </w:t>
+      </w:r>
+      <w:r>
+        <w:rPr>
+          <w:rStyle w:val="Strong"/>
+        </w:rPr>
+        <w:t>de manière structurée avec validation à chaque phase</w:t>
+      </w:r>
+      <w:r>
+        <w:t>.</w:t>
+      </w:r>
+    </w:p>
+    <w:p>
+      <w:pPr>
+        <w:pStyle w:val="Heading3"/>
+      </w:pPr>
+      <w:proofErr w:type="gramStart"/>
+      <w:r>
+        <w:rPr>
+          <w:rFonts w:ascii="Segoe UI Emoji" w:hAnsi="Segoe UI Emoji" w:cs="Segoe UI Emoji"/>
+        </w:rPr>
+        <w:t>🔷</w:t>
+      </w:r>
+      <w:proofErr w:type="gramEnd"/>
+      <w:r>
+        <w:t xml:space="preserve"> Pourquoi “en V” ?</w:t>
+      </w:r>
+    </w:p>
+    <w:p>
+      <w:pPr>
+        <w:pStyle w:val="NormalWeb"/>
+      </w:pPr>
+      <w:r>
+        <w:t>On l’appelle comme ça parce que les étapes forment un “V” :</w:t>
+      </w:r>
+    </w:p>
+    <w:p>
+      <w:pPr>
+        <w:numPr>
+          <w:ilvl w:val="0"/>
+          <w:numId w:val="14"/>
+        </w:numPr>
+        <w:spacing w:before="100" w:beforeAutospacing="1" w:after="100" w:afterAutospacing="1" w:line="240" w:lineRule="auto"/>
+      </w:pPr>
+      <w:r>
+        <w:rPr>
+          <w:rStyle w:val="Strong"/>
+        </w:rPr>
+        <w:t>Côté gauche (descente)</w:t>
+      </w:r>
+      <w:r>
+        <w:t xml:space="preserve"> → conception du système </w:t>
+      </w:r>
+    </w:p>
+    <w:p>
+      <w:pPr>
+        <w:numPr>
+          <w:ilvl w:val="0"/>
+          <w:numId w:val="14"/>
+        </w:numPr>
+        <w:spacing w:before="100" w:beforeAutospacing="1" w:after="100" w:afterAutospacing="1" w:line="240" w:lineRule="auto"/>
+      </w:pPr>
+      <w:r>
+        <w:rPr>
+          <w:rStyle w:val="Strong"/>
+        </w:rPr>
+        <w:t>Côté droit (montée)</w:t>
+      </w:r>
+      <w:r>
+        <w:t xml:space="preserve"> → tests et validation </w:t>
+      </w:r>
+    </w:p>
+    <w:p>
+      <w:pPr>
+        <w:spacing w:after="0"/>
+      </w:pPr>
+      <w:r>
+        <w:pict w14:anchorId="2FA63C45">
+          <v:rect id="_x0000_i1037" style="width:0;height:1.5pt" o:hralign="center" o:hrstd="t" o:hr="t" fillcolor="#a0a0a0" stroked="f"/>
+        </w:pict>
+      </w:r>
+    </w:p>
+    <w:p>
+      <w:pPr>
+        <w:pStyle w:val="Heading3"/>
+      </w:pPr>
+      <w:proofErr w:type="gramStart"/>
+      <w:r>
+        <w:rPr>
+          <w:rFonts w:ascii="Segoe UI Emoji" w:hAnsi="Segoe UI Emoji" w:cs="Segoe UI Emoji"/>
+        </w:rPr>
+        <w:t>🔽</w:t>
+      </w:r>
+      <w:proofErr w:type="gramEnd"/>
+      <w:r>
+        <w:t xml:space="preserve"> Partie gauche : Conception</w:t>
+      </w:r>
+    </w:p>
+    <w:p>
+      <w:pPr>
+        <w:pStyle w:val="NormalWeb"/>
+      </w:pPr>
+      <w:r>
+        <w:t>On part du besoin jusqu’au détail technique :</w:t>
+      </w:r>
+    </w:p>
+    <w:p>
+      <w:pPr>
+        <w:numPr>
+          <w:ilvl w:val="0"/>
+          <w:numId w:val="15"/>
+        </w:numPr>
+        <w:spacing w:before="100" w:beforeAutospacing="1" w:after="100" w:afterAutospacing="1" w:line="240" w:lineRule="auto"/>
+      </w:pPr>
+      <w:r>
+        <w:rPr>
+          <w:rStyle w:val="Strong"/>
+        </w:rPr>
+        <w:t>Expression des besoins</w:t>
+      </w:r>
+      <w:r>
+        <w:t xml:space="preserve"> → ce que veut le client </w:t>
+      </w:r>
+    </w:p>
+    <w:p>
+      <w:pPr>
+        <w:numPr>
+          <w:ilvl w:val="0"/>
+          <w:numId w:val="15"/>
+        </w:numPr>
+        <w:spacing w:before="100" w:beforeAutospacing="1" w:after="100" w:afterAutospacing="1" w:line="240" w:lineRule="auto"/>
+      </w:pPr>
+      <w:r>
+        <w:rPr>
+          <w:rStyle w:val="Strong"/>
+        </w:rPr>
+        <w:t>Spécifications fonctionnelles</w:t>
+      </w:r>
+      <w:r>
+        <w:t xml:space="preserve"> → ce que le système doit faire </w:t>
+      </w:r>
+    </w:p>
+    <w:p>
+      <w:pPr>
+        <w:numPr>
+          <w:ilvl w:val="0"/>
+          <w:numId w:val="15"/>
+        </w:numPr>
+        <w:spacing w:before="100" w:beforeAutospacing="1" w:after="100" w:afterAutospacing="1" w:line="240" w:lineRule="auto"/>
+      </w:pPr>
+      <w:r>
+        <w:rPr>
+          <w:rStyle w:val="Strong"/>
+        </w:rPr>
+        <w:t>Conception technique</w:t>
+      </w:r>
+      <w:r>
+        <w:t xml:space="preserve"> → comment on va le faire </w:t>
+      </w:r>
+    </w:p>
+    <w:p>
+      <w:pPr>
+        <w:numPr>
+          <w:ilvl w:val="0"/>
+          <w:numId w:val="15"/>
+        </w:numPr>
+        <w:spacing w:before="100" w:beforeAutospacing="1" w:after="100" w:afterAutospacing="1" w:line="240" w:lineRule="auto"/>
+      </w:pPr>
+      <w:r>
+        <w:rPr>
+          <w:rStyle w:val="Strong"/>
+        </w:rPr>
+        <w:t>Codage</w:t>
+      </w:r>
+      <w:r>
+        <w:t xml:space="preserve"> → développement </w:t>
+      </w:r>
+    </w:p>
+    <w:p>
+      <w:pPr>
+        <w:spacing w:after="0"/>
+      </w:pPr>
+      <w:r>
+        <w:pict w14:anchorId="1762F93D">
+          <v:rect id="_x0000_i1038" style="width:0;height:1.5pt" o:hralign="center" o:hrstd="t" o:hr="t" fillcolor="#a0a0a0" stroked="f"/>
+        </w:pict>
+      </w:r>
+    </w:p>
+    <w:p>
+      <w:pPr>
+        <w:pStyle w:val="Heading3"/>
+      </w:pPr>
+      <w:proofErr w:type="gramStart"/>
+      <w:r>
+        <w:rPr>
+          <w:rFonts w:ascii="Segoe UI Emoji" w:hAnsi="Segoe UI Emoji" w:cs="Segoe UI Emoji"/>
+        </w:rPr>
+        <w:t>🔼</w:t>
+      </w:r>
+      <w:proofErr w:type="gramEnd"/>
+      <w:r>
+        <w:t xml:space="preserve"> Partie droite : Tests</w:t>
+      </w:r>
+    </w:p>
+    <w:p>
+      <w:pPr>
+        <w:pStyle w:val="NormalWeb"/>
+      </w:pPr>
+      <w:r>
+        <w:t>Chaque étape à gauche a son test correspondant à droite :</w:t>
+      </w:r>
+    </w:p>
+    <w:p>
+      <w:pPr>
+        <w:numPr>
+          <w:ilvl w:val="0"/>
+          <w:numId w:val="16"/>
+        </w:numPr>
+        <w:spacing w:before="100" w:beforeAutospacing="1" w:after="100" w:afterAutospacing="1" w:line="240" w:lineRule="auto"/>
+      </w:pPr>
+      <w:r>
+        <w:rPr>
+          <w:rStyle w:val="Strong"/>
+        </w:rPr>
+        <w:lastRenderedPageBreak/>
+        <w:t>Tests unitaires</w:t>
+      </w:r>
+      <w:r>
+        <w:t xml:space="preserve"> → vérifier chaque fonction (lié au codage) </w:t>
+      </w:r>
+    </w:p>
+    <w:p>
+      <w:pPr>
+        <w:numPr>
+          <w:ilvl w:val="0"/>
+          <w:numId w:val="16"/>
+        </w:numPr>
+        <w:spacing w:before="100" w:beforeAutospacing="1" w:after="100" w:afterAutospacing="1" w:line="240" w:lineRule="auto"/>
+      </w:pPr>
+      <w:r>
+        <w:rPr>
+          <w:rStyle w:val="Strong"/>
+        </w:rPr>
+        <w:t>Tests d’intégration</w:t>
+      </w:r>
+      <w:r>
+        <w:t xml:space="preserve"> → vérifier que les modules marchent ensemble </w:t>
+      </w:r>
+    </w:p>
+    <w:p>
+      <w:pPr>
+        <w:numPr>
+          <w:ilvl w:val="0"/>
+          <w:numId w:val="16"/>
+        </w:numPr>
+        <w:spacing w:before="100" w:beforeAutospacing="1" w:after="100" w:afterAutospacing="1" w:line="240" w:lineRule="auto"/>
+      </w:pPr>
+      <w:r>
+        <w:rPr>
+          <w:rStyle w:val="Strong"/>
+        </w:rPr>
+        <w:t>Tests système</w:t>
+      </w:r>
+      <w:r>
+        <w:t xml:space="preserve"> → vérifier tout le système </w:t>
+      </w:r>
+    </w:p>
+    <w:p>
+      <w:pPr>
+        <w:numPr>
+          <w:ilvl w:val="0"/>
+          <w:numId w:val="16"/>
+        </w:numPr>
+        <w:spacing w:before="100" w:beforeAutospacing="1" w:after="100" w:afterAutospacing="1" w:line="240" w:lineRule="auto"/>
+      </w:pPr>
+      <w:r>
+        <w:rPr>
+          <w:rStyle w:val="Strong"/>
+        </w:rPr>
+        <w:t>Tests de validation (recette)</w:t>
+      </w:r>
+      <w:r>
+        <w:t xml:space="preserve"> → vérifier avec le client </w:t>
+      </w:r>
+    </w:p>
+    <w:p>
+      <w:pPr>
+        <w:pStyle w:val="NormalWeb"/>
+      </w:pPr>
+      <w:proofErr w:type="gramStart"/>
+      <w:r>
+        <w:rPr>
+          <w:rFonts w:ascii="Segoe UI Emoji" w:hAnsi="Segoe UI Emoji" w:cs="Segoe UI Emoji"/>
+        </w:rPr>
+        <w:t>👉</w:t>
+      </w:r>
+      <w:proofErr w:type="gramEnd"/>
+      <w:r>
+        <w:t xml:space="preserve"> L’idée importante :</w:t>
+      </w:r>
+      <w:r>
+        <w:br/>
+      </w:r>
+      <w:r>
+        <w:rPr>
+          <w:rStyle w:val="Strong"/>
+        </w:rPr>
+        <w:t>Chaque étape de conception a son test associé</w:t>
+      </w:r>
+      <w:r>
+        <w:t xml:space="preserve"> (ex : spécifications ↔ tests système).</w:t>
+      </w:r>
+    </w:p>
+    <w:p>
+      <w:r>
+        <w:pict w14:anchorId="4B00484A">
+          <v:rect id="_x0000_i1039" style="width:0;height:1.5pt" o:hralign="center" o:hrstd="t" o:hr="t" fillcolor="#a0a0a0" stroked="f"/>
+        </w:pict>
+      </w:r>
+    </w:p>
+    <w:p>
+      <w:pPr>
+        <w:pStyle w:val="Heading3"/>
+      </w:pPr>
+      <w:proofErr w:type="gramStart"/>
+      <w:r>
+        <w:rPr>
+          <w:rFonts w:ascii="Segoe UI Emoji" w:hAnsi="Segoe UI Emoji" w:cs="Segoe UI Emoji"/>
+        </w:rPr>
+        <w:t>🎯</w:t>
+      </w:r>
+      <w:proofErr w:type="gramEnd"/>
+      <w:r>
+        <w:t xml:space="preserve"> Avantages</w:t>
+      </w:r>
+    </w:p>
+    <w:p>
+      <w:pPr>
+        <w:numPr>
+          <w:ilvl w:val="0"/>
+          <w:numId w:val="17"/>
+        </w:numPr>
+        <w:spacing w:before="100" w:beforeAutospacing="1" w:after="100" w:afterAutospacing="1" w:line="240" w:lineRule="auto"/>
+      </w:pPr>
+      <w:r>
+        <w:t xml:space="preserve">Organisation claire </w:t>
+      </w:r>
+    </w:p>
+    <w:p>
+      <w:pPr>
+        <w:numPr>
+          <w:ilvl w:val="0"/>
+          <w:numId w:val="17"/>
+        </w:numPr>
+        <w:spacing w:before="100" w:beforeAutospacing="1" w:after="100" w:afterAutospacing="1" w:line="240" w:lineRule="auto"/>
+      </w:pPr>
+      <w:r>
+        <w:t xml:space="preserve">Détection des erreurs tôt </w:t>
+      </w:r>
+    </w:p>
+    <w:p>
+      <w:pPr>
+        <w:numPr>
+          <w:ilvl w:val="0"/>
+          <w:numId w:val="17"/>
+        </w:numPr>
+        <w:spacing w:before="100" w:beforeAutospacing="1" w:after="100" w:afterAutospacing="1" w:line="240" w:lineRule="auto"/>
+      </w:pPr>
+      <w:r>
+        <w:t>Bon pour projets structurés (</w:t>
+      </w:r>
+      <w:proofErr w:type="gramStart"/>
+      <w:r>
+        <w:t>ex:</w:t>
+      </w:r>
+      <w:proofErr w:type="gramEnd"/>
+      <w:r>
+        <w:t xml:space="preserve"> systèmes critiques) </w:t>
+      </w:r>
+    </w:p>
+    <w:p>
+      <w:pPr>
+        <w:pStyle w:val="Heading3"/>
+      </w:pPr>
+      <w:r>
+        <w:rPr>
+          <w:rFonts w:ascii="Segoe UI Emoji" w:hAnsi="Segoe UI Emoji" w:cs="Segoe UI Emoji"/>
+        </w:rPr>
+        <w:t>⚠</w:t>
+      </w:r>
+      <w:r>
+        <w:t>️ Inconvénients</w:t>
+      </w:r>
+    </w:p>
+    <w:p>
+      <w:pPr>
+        <w:numPr>
+          <w:ilvl w:val="0"/>
+          <w:numId w:val="18"/>
+        </w:numPr>
+        <w:spacing w:before="100" w:beforeAutospacing="1" w:after="100" w:afterAutospacing="1" w:line="240" w:lineRule="auto"/>
+      </w:pPr>
+      <w:r>
+        <w:t xml:space="preserve">Peu flexible (difficile de changer les besoins en cours) </w:t>
+      </w:r>
+    </w:p>
+    <w:p>
+      <w:pPr>
+        <w:numPr>
+          <w:ilvl w:val="0"/>
+          <w:numId w:val="18"/>
+        </w:numPr>
+        <w:spacing w:before="100" w:beforeAutospacing="1" w:after="100" w:afterAutospacing="1" w:line="240" w:lineRule="auto"/>
+      </w:pPr>
+      <w:r>
+        <w:t xml:space="preserve">Pas adapté aux projets modernes très évolutifs (où on préfère Agile) </w:t>
+      </w:r>
+    </w:p>
+    <w:p>
+      <w:pPr>
+        <w:spacing w:after="0"/>
+      </w:pPr>
+      <w:r>
+        <w:pict w14:anchorId="64E22263">
+          <v:rect id="_x0000_i1040" style="width:0;height:1.5pt" o:hralign="center" o:hrstd="t" o:hr="t" fillcolor="#a0a0a0" stroked="f"/>
+        </w:pict>
+      </w:r>
+    </w:p>
+    <w:p>
+      <w:pPr>
+        <w:pStyle w:val="Heading3"/>
+      </w:pPr>
+      <w:proofErr w:type="gramStart"/>
+      <w:r>
+        <w:rPr>
+          <w:rFonts w:ascii="Segoe UI Emoji" w:hAnsi="Segoe UI Emoji" w:cs="Segoe UI Emoji"/>
+        </w:rPr>
+        <w:t>💡</w:t>
+      </w:r>
+      <w:proofErr w:type="gramEnd"/>
+      <w:r>
+        <w:t xml:space="preserve"> Exemple simple</w:t>
+      </w:r>
+    </w:p>
+    <w:p>
+      <w:pPr>
+        <w:pStyle w:val="NormalWeb"/>
+      </w:pPr>
+      <w:r>
+        <w:t>Tu développes une app de réservation :</w:t>
+      </w:r>
+    </w:p>
+    <w:p>
+      <w:pPr>
+        <w:numPr>
+          <w:ilvl w:val="0"/>
+          <w:numId w:val="19"/>
+        </w:numPr>
+        <w:spacing w:before="100" w:beforeAutospacing="1" w:after="100" w:afterAutospacing="1" w:line="240" w:lineRule="auto"/>
+      </w:pPr>
+      <w:r>
+        <w:t xml:space="preserve">Tu définis les besoins (réserver service) </w:t>
+      </w:r>
+    </w:p>
+    <w:p>
+      <w:pPr>
+        <w:numPr>
+          <w:ilvl w:val="0"/>
+          <w:numId w:val="19"/>
+        </w:numPr>
+        <w:spacing w:before="100" w:beforeAutospacing="1" w:after="100" w:afterAutospacing="1" w:line="240" w:lineRule="auto"/>
+      </w:pPr>
+      <w:r>
+        <w:t xml:space="preserve">Tu conçois les fonctionnalités </w:t>
+      </w:r>
+    </w:p>
+    <w:p>
+      <w:pPr>
+        <w:numPr>
+          <w:ilvl w:val="0"/>
+          <w:numId w:val="19"/>
+        </w:numPr>
+        <w:spacing w:before="100" w:beforeAutospacing="1" w:after="100" w:afterAutospacing="1" w:line="240" w:lineRule="auto"/>
+      </w:pPr>
+      <w:r>
+        <w:t xml:space="preserve">Tu codes </w:t>
+      </w:r>
+    </w:p>
+    <w:p>
+      <w:pPr>
+        <w:numPr>
+          <w:ilvl w:val="0"/>
+          <w:numId w:val="19"/>
+        </w:numPr>
+        <w:spacing w:before="100" w:beforeAutospacing="1" w:after="100" w:afterAutospacing="1" w:line="240" w:lineRule="auto"/>
+      </w:pPr>
+      <w:r>
+        <w:t>Puis tu testes chaque partie pour vérifier que ça correspond au besoin initial</w:t>
+      </w:r>
+    </w:p>
+    <w:p>
+      <w:pPr>
+        <w:pStyle w:val="Heading2"/>
+        <w:shd w:val="clear" w:color="auto" w:fill="151517"/>
+        <w:spacing w:before="480" w:beforeAutospacing="0" w:after="240" w:afterAutospacing="0" w:line="480" w:lineRule="atLeast"/>
+        <w:rPr>
+          <w:rFonts w:ascii="Segoe UI" w:hAnsi="Segoe UI" w:cs="Segoe UI"/>
+          <w:color w:val="F9FAFB"/>
+          <w:sz w:val="33"/>
+          <w:szCs w:val="33"/>
+        </w:rPr>
+      </w:pPr>
+      <w:proofErr w:type="spellStart"/>
+      <w:r>
+        <w:t>Evenement</w:t>
+      </w:r>
+      <w:proofErr w:type="spellEnd"/>
+      <w:r>
+        <w:t xml:space="preserve"> </w:t>
+      </w:r>
+      <w:proofErr w:type="spellStart"/>
+      <w:r>
+        <w:t>listenner</w:t>
+      </w:r>
+      <w:proofErr w:type="spellEnd"/>
+      <w:r>
+        <w:t xml:space="preserve"> pour connait le user connecte et </w:t>
+      </w:r>
+      <w:proofErr w:type="spellStart"/>
+      <w:r>
+        <w:t>referch</w:t>
+      </w:r>
+      <w:proofErr w:type="spellEnd"/>
+      <w:r>
+        <w:t xml:space="preserve"> les interfaces selon le user (</w:t>
+      </w:r>
+      <w:proofErr w:type="spellStart"/>
+      <w:r>
+        <w:t>losque</w:t>
+      </w:r>
+      <w:proofErr w:type="spellEnd"/>
+      <w:r>
+        <w:t xml:space="preserve"> on fait le </w:t>
+      </w:r>
+      <w:proofErr w:type="spellStart"/>
+      <w:r>
+        <w:t>le</w:t>
+      </w:r>
+      <w:proofErr w:type="spellEnd"/>
+      <w:r>
+        <w:t xml:space="preserve"> </w:t>
+      </w:r>
+      <w:proofErr w:type="gramStart"/>
+      <w:r>
+        <w:t>login )</w:t>
+      </w:r>
+      <w:proofErr w:type="gramEnd"/>
+      <w:r>
+        <w:br/>
+      </w:r>
+      <w:r>
+        <w:rPr>
+          <w:rStyle w:val="Strong"/>
+          <w:rFonts w:ascii="Segoe UI" w:hAnsi="Segoe UI" w:cs="Segoe UI"/>
+          <w:b/>
+          <w:bCs/>
+          <w:color w:val="F9FAFB"/>
+          <w:sz w:val="33"/>
+          <w:szCs w:val="33"/>
+        </w:rPr>
+        <w:t>Résumé</w:t>
+      </w:r>
+    </w:p>
+    <w:tbl>
+      <w:tblPr>
+        <w:tblW w:w="9360" w:type="dxa"/>
+        <w:tblCellMar>
+          <w:top w:w="15" w:type="dxa"/>
+          <w:left w:w="15" w:type="dxa"/>
+          <w:bottom w:w="15" w:type="dxa"/>
+          <w:right w:w="15" w:type="dxa"/>
+        </w:tblCellMar>
+        <w:tblLook w:val="04A0" w:firstRow="1" w:lastRow="0" w:firstColumn="1" w:lastColumn="0" w:noHBand="0" w:noVBand="1"/>
+      </w:tblPr>
+      <w:tblGrid>
+        <w:gridCol w:w="4555"/>
+        <w:gridCol w:w="4805"/>
+      </w:tblGrid>
+      <w:tr>
+        <w:trPr>
+          <w:tblHeader/>
+        </w:trPr>
+        <w:tc>
+          <w:tcPr>
+            <w:tcW w:w="0" w:type="auto"/>
+            <w:tcBorders>
+              <w:top w:val="nil"/>
+            </w:tcBorders>
+            <w:tcMar>
+              <w:top w:w="150" w:type="dxa"/>
+              <w:left w:w="0" w:type="dxa"/>
+              <w:bottom w:w="150" w:type="dxa"/>
+              <w:right w:w="240" w:type="dxa"/>
+            </w:tcMar>
+            <w:vAlign w:val="center"/>
+            <w:hideMark/>
+          </w:tcPr>
+          <w:p>
+            <w:pPr>
+              <w:spacing w:line="375" w:lineRule="atLeast"/>
+              <w:rPr>
+                <w:rFonts w:ascii="Segoe UI" w:hAnsi="Segoe UI" w:cs="Segoe UI"/>
+                <w:sz w:val="23"/>
+                <w:szCs w:val="23"/>
+              </w:rPr>
+            </w:pPr>
+            <w:r>
+              <w:rPr>
+                <w:rFonts w:ascii="Segoe UI" w:hAnsi="Segoe UI" w:cs="Segoe UI"/>
+                <w:sz w:val="23"/>
+                <w:szCs w:val="23"/>
+              </w:rPr>
+              <w:t>Question</w:t>
+            </w:r>
+          </w:p>
+        </w:tc>
+        <w:tc>
+          <w:tcPr>
+            <w:tcW w:w="0" w:type="auto"/>
+            <w:tcBorders>
+              <w:top w:val="nil"/>
+            </w:tcBorders>
+            <w:tcMar>
+              <w:top w:w="150" w:type="dxa"/>
+              <w:left w:w="240" w:type="dxa"/>
+              <w:bottom w:w="150" w:type="dxa"/>
+              <w:right w:w="240" w:type="dxa"/>
+            </w:tcMar>
+            <w:vAlign w:val="center"/>
+            <w:hideMark/>
+          </w:tcPr>
+          <w:p>
+            <w:pPr>
+              <w:spacing w:line="375" w:lineRule="atLeast"/>
+              <w:rPr>
+                <w:rFonts w:ascii="Segoe UI" w:hAnsi="Segoe UI" w:cs="Segoe UI"/>
+                <w:sz w:val="23"/>
+                <w:szCs w:val="23"/>
+              </w:rPr>
+            </w:pPr>
+            <w:r>
+              <w:rPr>
+                <w:rFonts w:ascii="Segoe UI" w:hAnsi="Segoe UI" w:cs="Segoe UI"/>
+                <w:sz w:val="23"/>
+                <w:szCs w:val="23"/>
+              </w:rPr>
+              <w:t>Réponse</w:t>
+            </w:r>
+          </w:p>
+        </w:tc>
+      </w:tr>
+      <w:tr>
+        <w:tc>
+          <w:tcPr>
+            <w:tcW w:w="0" w:type="auto"/>
+            <w:tcMar>
+              <w:top w:w="150" w:type="dxa"/>
+              <w:left w:w="0" w:type="dxa"/>
+              <w:bottom w:w="150" w:type="dxa"/>
+              <w:right w:w="240" w:type="dxa"/>
+            </w:tcMar>
+            <w:vAlign w:val="center"/>
+            <w:hideMark/>
+          </w:tcPr>
+          <w:p>
+            <w:pPr>
+              <w:spacing w:line="375" w:lineRule="atLeast"/>
+              <w:rPr>
+                <w:rFonts w:ascii="Segoe UI" w:hAnsi="Segoe UI" w:cs="Segoe UI"/>
+                <w:sz w:val="23"/>
+                <w:szCs w:val="23"/>
+              </w:rPr>
+            </w:pPr>
+            <w:r>
+              <w:rPr>
+                <w:rStyle w:val="Strong"/>
+                <w:rFonts w:ascii="Segoe UI" w:hAnsi="Segoe UI" w:cs="Segoe UI"/>
+                <w:sz w:val="23"/>
+                <w:szCs w:val="23"/>
+              </w:rPr>
+              <w:t>Utilisez-vous du polling ?</w:t>
+            </w:r>
+          </w:p>
+        </w:tc>
+        <w:tc>
+          <w:tcPr>
+            <w:tcW w:w="0" w:type="auto"/>
+            <w:tcMar>
+              <w:top w:w="150" w:type="dxa"/>
+              <w:left w:w="240" w:type="dxa"/>
+              <w:bottom w:w="150" w:type="dxa"/>
+              <w:right w:w="0" w:type="dxa"/>
+            </w:tcMar>
+            <w:vAlign w:val="center"/>
+            <w:hideMark/>
+          </w:tcPr>
+          <w:p>
+            <w:pPr>
+              <w:spacing w:line="375" w:lineRule="atLeast"/>
+              <w:rPr>
+                <w:rFonts w:ascii="Segoe UI" w:hAnsi="Segoe UI" w:cs="Segoe UI"/>
+                <w:sz w:val="23"/>
+                <w:szCs w:val="23"/>
+              </w:rPr>
+            </w:pPr>
+            <w:r>
+              <w:rPr>
+                <w:rFonts w:ascii="Segoe UI Emoji" w:hAnsi="Segoe UI Emoji" w:cs="Segoe UI Emoji"/>
+                <w:sz w:val="23"/>
+                <w:szCs w:val="23"/>
+              </w:rPr>
+              <w:t>❌</w:t>
+            </w:r>
+            <w:r>
+              <w:rPr>
+                <w:rFonts w:ascii="Segoe UI" w:hAnsi="Segoe UI" w:cs="Segoe UI"/>
+                <w:sz w:val="23"/>
+                <w:szCs w:val="23"/>
+              </w:rPr>
+              <w:t xml:space="preserve"> NON</w:t>
+            </w:r>
+          </w:p>
+        </w:tc>
+      </w:tr>
+      <w:tr>
+        <w:tc>
+          <w:tcPr>
+            <w:tcW w:w="0" w:type="auto"/>
+            <w:tcMar>
+              <w:top w:w="150" w:type="dxa"/>
+              <w:left w:w="0" w:type="dxa"/>
+              <w:bottom w:w="150" w:type="dxa"/>
+              <w:right w:w="240" w:type="dxa"/>
+            </w:tcMar>
+            <w:vAlign w:val="center"/>
+            <w:hideMark/>
+          </w:tcPr>
+          <w:p>
+            <w:pPr>
+              <w:spacing w:line="375" w:lineRule="atLeast"/>
+              <w:rPr>
+                <w:rFonts w:ascii="Segoe UI" w:hAnsi="Segoe UI" w:cs="Segoe UI"/>
+                <w:sz w:val="23"/>
+                <w:szCs w:val="23"/>
+              </w:rPr>
+            </w:pPr>
+            <w:r>
+              <w:rPr>
+                <w:rStyle w:val="Strong"/>
+                <w:rFonts w:ascii="Segoe UI" w:hAnsi="Segoe UI" w:cs="Segoe UI"/>
+                <w:sz w:val="23"/>
+                <w:szCs w:val="23"/>
+              </w:rPr>
+              <w:t xml:space="preserve">Utilisez-vous des </w:t>
+            </w:r>
+            <w:proofErr w:type="spellStart"/>
+            <w:r>
+              <w:rPr>
+                <w:rStyle w:val="Strong"/>
+                <w:rFonts w:ascii="Segoe UI" w:hAnsi="Segoe UI" w:cs="Segoe UI"/>
+                <w:sz w:val="23"/>
+                <w:szCs w:val="23"/>
+              </w:rPr>
+              <w:t>event</w:t>
+            </w:r>
+            <w:proofErr w:type="spellEnd"/>
+            <w:r>
+              <w:rPr>
+                <w:rStyle w:val="Strong"/>
+                <w:rFonts w:ascii="Segoe UI" w:hAnsi="Segoe UI" w:cs="Segoe UI"/>
+                <w:sz w:val="23"/>
+                <w:szCs w:val="23"/>
+              </w:rPr>
+              <w:t xml:space="preserve"> </w:t>
+            </w:r>
+            <w:proofErr w:type="spellStart"/>
+            <w:r>
+              <w:rPr>
+                <w:rStyle w:val="Strong"/>
+                <w:rFonts w:ascii="Segoe UI" w:hAnsi="Segoe UI" w:cs="Segoe UI"/>
+                <w:sz w:val="23"/>
+                <w:szCs w:val="23"/>
+              </w:rPr>
+              <w:t>listeners</w:t>
+            </w:r>
+            <w:proofErr w:type="spellEnd"/>
+            <w:r>
+              <w:rPr>
+                <w:rStyle w:val="Strong"/>
+                <w:rFonts w:ascii="Segoe UI" w:hAnsi="Segoe UI" w:cs="Segoe UI"/>
+                <w:sz w:val="23"/>
+                <w:szCs w:val="23"/>
+              </w:rPr>
+              <w:t xml:space="preserve"> ?</w:t>
+            </w:r>
+          </w:p>
+        </w:tc>
+        <w:tc>
+          <w:tcPr>
+            <w:tcW w:w="0" w:type="auto"/>
+            <w:tcMar>
+              <w:top w:w="150" w:type="dxa"/>
+              <w:left w:w="240" w:type="dxa"/>
+              <w:bottom w:w="150" w:type="dxa"/>
+              <w:right w:w="0" w:type="dxa"/>
+            </w:tcMar>
+            <w:vAlign w:val="center"/>
+            <w:hideMark/>
+          </w:tcPr>
+          <w:p>
+            <w:pPr>
+              <w:spacing w:line="375" w:lineRule="atLeast"/>
+              <w:rPr>
+                <w:rFonts w:ascii="Segoe UI" w:hAnsi="Segoe UI" w:cs="Segoe UI"/>
+                <w:sz w:val="23"/>
+                <w:szCs w:val="23"/>
+              </w:rPr>
+            </w:pPr>
+            <w:r>
+              <w:rPr>
+                <w:rFonts w:ascii="Segoe UI Emoji" w:hAnsi="Segoe UI Emoji" w:cs="Segoe UI Emoji"/>
+                <w:sz w:val="23"/>
+                <w:szCs w:val="23"/>
+              </w:rPr>
+              <w:t>✅</w:t>
+            </w:r>
+            <w:r>
+              <w:rPr>
+                <w:rFonts w:ascii="Segoe UI" w:hAnsi="Segoe UI" w:cs="Segoe UI"/>
+                <w:sz w:val="23"/>
+                <w:szCs w:val="23"/>
+              </w:rPr>
+              <w:t xml:space="preserve"> OUI</w:t>
+            </w:r>
+          </w:p>
+        </w:tc>
+      </w:tr>
+      <w:tr>
+        <w:tc>
+          <w:tcPr>
+            <w:tcW w:w="0" w:type="auto"/>
+            <w:tcMar>
+              <w:top w:w="150" w:type="dxa"/>
+              <w:left w:w="0" w:type="dxa"/>
+              <w:bottom w:w="150" w:type="dxa"/>
+              <w:right w:w="240" w:type="dxa"/>
+            </w:tcMar>
+            <w:vAlign w:val="center"/>
+            <w:hideMark/>
+          </w:tcPr>
+          <w:p>
+            <w:pPr>
+              <w:spacing w:line="375" w:lineRule="atLeast"/>
+              <w:rPr>
+                <w:rFonts w:ascii="Segoe UI" w:hAnsi="Segoe UI" w:cs="Segoe UI"/>
+                <w:sz w:val="23"/>
+                <w:szCs w:val="23"/>
+              </w:rPr>
+            </w:pPr>
+            <w:r>
+              <w:rPr>
+                <w:rStyle w:val="Strong"/>
+                <w:rFonts w:ascii="Segoe UI" w:hAnsi="Segoe UI" w:cs="Segoe UI"/>
+                <w:sz w:val="23"/>
+                <w:szCs w:val="23"/>
+              </w:rPr>
+              <w:lastRenderedPageBreak/>
+              <w:t>Qui déclenche les événements ?</w:t>
+            </w:r>
+          </w:p>
+        </w:tc>
+        <w:tc>
+          <w:tcPr>
+            <w:tcW w:w="0" w:type="auto"/>
+            <w:tcMar>
+              <w:top w:w="150" w:type="dxa"/>
+              <w:left w:w="240" w:type="dxa"/>
+              <w:bottom w:w="150" w:type="dxa"/>
+              <w:right w:w="0" w:type="dxa"/>
+            </w:tcMar>
+            <w:vAlign w:val="center"/>
+            <w:hideMark/>
+          </w:tcPr>
+          <w:p>
+            <w:pPr>
+              <w:spacing w:line="375" w:lineRule="atLeast"/>
+              <w:rPr>
+                <w:rFonts w:ascii="Segoe UI" w:hAnsi="Segoe UI" w:cs="Segoe UI"/>
+                <w:sz w:val="23"/>
+                <w:szCs w:val="23"/>
+              </w:rPr>
+            </w:pPr>
+            <w:r>
+              <w:rPr>
+                <w:rFonts w:ascii="Segoe UI" w:hAnsi="Segoe UI" w:cs="Segoe UI"/>
+                <w:sz w:val="23"/>
+                <w:szCs w:val="23"/>
+              </w:rPr>
+              <w:t>Le navigateur ou </w:t>
+            </w:r>
+            <w:proofErr w:type="spellStart"/>
+            <w:r>
+              <w:rPr>
+                <w:rStyle w:val="HTMLCode"/>
+                <w:rFonts w:ascii="Consolas" w:eastAsiaTheme="minorHAnsi" w:hAnsi="Consolas"/>
+                <w:shd w:val="clear" w:color="auto" w:fill="2C2C2E"/>
+              </w:rPr>
+              <w:t>dispatchEvent</w:t>
+            </w:r>
+            <w:proofErr w:type="spellEnd"/>
+          </w:p>
+        </w:tc>
+      </w:tr>
+      <w:tr>
+        <w:tc>
+          <w:tcPr>
+            <w:tcW w:w="0" w:type="auto"/>
+            <w:tcMar>
+              <w:top w:w="150" w:type="dxa"/>
+              <w:left w:w="0" w:type="dxa"/>
+              <w:bottom w:w="150" w:type="dxa"/>
+              <w:right w:w="240" w:type="dxa"/>
+            </w:tcMar>
+            <w:vAlign w:val="center"/>
+            <w:hideMark/>
+          </w:tcPr>
+          <w:p>
+            <w:pPr>
+              <w:spacing w:line="375" w:lineRule="atLeast"/>
+              <w:rPr>
+                <w:rFonts w:ascii="Segoe UI" w:hAnsi="Segoe UI" w:cs="Segoe UI"/>
+                <w:sz w:val="23"/>
+                <w:szCs w:val="23"/>
+              </w:rPr>
+            </w:pPr>
+            <w:r>
+              <w:rPr>
+                <w:rStyle w:val="Strong"/>
+                <w:rFonts w:ascii="Segoe UI" w:hAnsi="Segoe UI" w:cs="Segoe UI"/>
+                <w:sz w:val="23"/>
+                <w:szCs w:val="23"/>
+              </w:rPr>
+              <w:t>Est-ce performant ?</w:t>
+            </w:r>
+          </w:p>
+        </w:tc>
+        <w:tc>
+          <w:tcPr>
+            <w:tcW w:w="0" w:type="auto"/>
+            <w:tcMar>
+              <w:top w:w="150" w:type="dxa"/>
+              <w:left w:w="240" w:type="dxa"/>
+              <w:bottom w:w="150" w:type="dxa"/>
+              <w:right w:w="0" w:type="dxa"/>
+            </w:tcMar>
+            <w:vAlign w:val="center"/>
+            <w:hideMark/>
+          </w:tcPr>
+          <w:p>
+            <w:pPr>
+              <w:spacing w:line="375" w:lineRule="atLeast"/>
+              <w:rPr>
+                <w:rFonts w:ascii="Segoe UI" w:hAnsi="Segoe UI" w:cs="Segoe UI"/>
+                <w:sz w:val="23"/>
+                <w:szCs w:val="23"/>
+              </w:rPr>
+            </w:pPr>
+            <w:r>
+              <w:rPr>
+                <w:rFonts w:ascii="Segoe UI Emoji" w:hAnsi="Segoe UI Emoji" w:cs="Segoe UI Emoji"/>
+                <w:sz w:val="23"/>
+                <w:szCs w:val="23"/>
+              </w:rPr>
+              <w:t>✅</w:t>
+            </w:r>
+            <w:r>
+              <w:rPr>
+                <w:rFonts w:ascii="Segoe UI" w:hAnsi="Segoe UI" w:cs="Segoe UI"/>
+                <w:sz w:val="23"/>
+                <w:szCs w:val="23"/>
+              </w:rPr>
+              <w:t xml:space="preserve"> Très performant</w:t>
+            </w:r>
+          </w:p>
+        </w:tc>
+      </w:tr>
+      <w:tr>
+        <w:tc>
+          <w:tcPr>
+            <w:tcW w:w="0" w:type="auto"/>
+            <w:tcMar>
+              <w:top w:w="150" w:type="dxa"/>
+              <w:left w:w="0" w:type="dxa"/>
+              <w:bottom w:w="150" w:type="dxa"/>
+              <w:right w:w="240" w:type="dxa"/>
+            </w:tcMar>
+            <w:vAlign w:val="center"/>
+            <w:hideMark/>
+          </w:tcPr>
+          <w:p>
+            <w:pPr>
+              <w:spacing w:line="375" w:lineRule="atLeast"/>
+              <w:rPr>
+                <w:rFonts w:ascii="Segoe UI" w:hAnsi="Segoe UI" w:cs="Segoe UI"/>
+                <w:sz w:val="23"/>
+                <w:szCs w:val="23"/>
+              </w:rPr>
+            </w:pPr>
+            <w:r>
+              <w:rPr>
+                <w:rStyle w:val="Strong"/>
+                <w:rFonts w:ascii="Segoe UI" w:hAnsi="Segoe UI" w:cs="Segoe UI"/>
+                <w:sz w:val="23"/>
+                <w:szCs w:val="23"/>
+              </w:rPr>
+              <w:t>Y a-t-il des dépendances ?</w:t>
+            </w:r>
+          </w:p>
+        </w:tc>
+        <w:tc>
+          <w:tcPr>
+            <w:tcW w:w="0" w:type="auto"/>
+            <w:tcMar>
+              <w:top w:w="150" w:type="dxa"/>
+              <w:left w:w="240" w:type="dxa"/>
+              <w:bottom w:w="150" w:type="dxa"/>
+              <w:right w:w="0" w:type="dxa"/>
+            </w:tcMar>
+            <w:vAlign w:val="center"/>
+            <w:hideMark/>
+          </w:tcPr>
+          <w:p>
+            <w:pPr>
+              <w:spacing w:line="375" w:lineRule="atLeast"/>
+              <w:rPr>
+                <w:rFonts w:ascii="Segoe UI" w:hAnsi="Segoe UI" w:cs="Segoe UI"/>
+                <w:sz w:val="23"/>
+                <w:szCs w:val="23"/>
+              </w:rPr>
+            </w:pPr>
+            <w:r>
+              <w:rPr>
+                <w:rFonts w:ascii="Segoe UI Emoji" w:hAnsi="Segoe UI Emoji" w:cs="Segoe UI Emoji"/>
+                <w:sz w:val="23"/>
+                <w:szCs w:val="23"/>
+              </w:rPr>
+              <w:t>❌</w:t>
+            </w:r>
+            <w:r>
+              <w:rPr>
+                <w:rFonts w:ascii="Segoe UI" w:hAnsi="Segoe UI" w:cs="Segoe UI"/>
+                <w:sz w:val="23"/>
+                <w:szCs w:val="23"/>
+              </w:rPr>
+              <w:t xml:space="preserve"> Aucune (API native du navigateur)</w:t>
+            </w:r>
+          </w:p>
+        </w:tc>
+      </w:tr>
+    </w:tbl>
     <w:p/>
     <w:sectPr>
       <w:pgSz w:w="11906" w:h="16838"/>
@@ -3545,6 +4638,304 @@
     </w:lvl>
   </w:abstractNum>
   <w:abstractNum w:abstractNumId="4" w15:restartNumberingAfterBreak="0">
+    <w:nsid w:val="1BDF6D42"/>
+    <w:multiLevelType w:val="multilevel"/>
+    <w:tmpl w:val="9A8A2EA4"/>
+    <w:lvl w:ilvl="0">
+      <w:start w:val="1"/>
+      <w:numFmt w:val="bullet"/>
+      <w:lvlText w:val=""/>
+      <w:lvlJc w:val="left"/>
+      <w:pPr>
+        <w:tabs>
+          <w:tab w:val="num" w:pos="720"/>
+        </w:tabs>
+        <w:ind w:left="720" w:hanging="360"/>
+      </w:pPr>
+      <w:rPr>
+        <w:rFonts w:ascii="Symbol" w:hAnsi="Symbol" w:hint="default"/>
+        <w:sz w:val="20"/>
+      </w:rPr>
+    </w:lvl>
+    <w:lvl w:ilvl="1" w:tentative="1">
+      <w:start w:val="1"/>
+      <w:numFmt w:val="bullet"/>
+      <w:lvlText w:val="o"/>
+      <w:lvlJc w:val="left"/>
+      <w:pPr>
+        <w:tabs>
+          <w:tab w:val="num" w:pos="1440"/>
+        </w:tabs>
+        <w:ind w:left="1440" w:hanging="360"/>
+      </w:pPr>
+      <w:rPr>
+        <w:rFonts w:ascii="Courier New" w:hAnsi="Courier New" w:hint="default"/>
+        <w:sz w:val="20"/>
+      </w:rPr>
+    </w:lvl>
+    <w:lvl w:ilvl="2" w:tentative="1">
+      <w:start w:val="1"/>
+      <w:numFmt w:val="bullet"/>
+      <w:lvlText w:val=""/>
+      <w:lvlJc w:val="left"/>
+      <w:pPr>
+        <w:tabs>
+          <w:tab w:val="num" w:pos="2160"/>
+        </w:tabs>
+        <w:ind w:left="2160" w:hanging="360"/>
+      </w:pPr>
+      <w:rPr>
+        <w:rFonts w:ascii="Wingdings" w:hAnsi="Wingdings" w:hint="default"/>
+        <w:sz w:val="20"/>
+      </w:rPr>
+    </w:lvl>
+    <w:lvl w:ilvl="3" w:tentative="1">
+      <w:start w:val="1"/>
+      <w:numFmt w:val="bullet"/>
+      <w:lvlText w:val=""/>
+      <w:lvlJc w:val="left"/>
+      <w:pPr>
+        <w:tabs>
+          <w:tab w:val="num" w:pos="2880"/>
+        </w:tabs>
+        <w:ind w:left="2880" w:hanging="360"/>
+      </w:pPr>
+      <w:rPr>
+        <w:rFonts w:ascii="Wingdings" w:hAnsi="Wingdings" w:hint="default"/>
+        <w:sz w:val="20"/>
+      </w:rPr>
+    </w:lvl>
+    <w:lvl w:ilvl="4" w:tentative="1">
+      <w:start w:val="1"/>
+      <w:numFmt w:val="bullet"/>
+      <w:lvlText w:val=""/>
+      <w:lvlJc w:val="left"/>
+      <w:pPr>
+        <w:tabs>
+          <w:tab w:val="num" w:pos="3600"/>
+        </w:tabs>
+        <w:ind w:left="3600" w:hanging="360"/>
+      </w:pPr>
+      <w:rPr>
+        <w:rFonts w:ascii="Wingdings" w:hAnsi="Wingdings" w:hint="default"/>
+        <w:sz w:val="20"/>
+      </w:rPr>
+    </w:lvl>
+    <w:lvl w:ilvl="5" w:tentative="1">
+      <w:start w:val="1"/>
+      <w:numFmt w:val="bullet"/>
+      <w:lvlText w:val=""/>
+      <w:lvlJc w:val="left"/>
+      <w:pPr>
+        <w:tabs>
+          <w:tab w:val="num" w:pos="4320"/>
+        </w:tabs>
+        <w:ind w:left="4320" w:hanging="360"/>
+      </w:pPr>
+      <w:rPr>
+        <w:rFonts w:ascii="Wingdings" w:hAnsi="Wingdings" w:hint="default"/>
+        <w:sz w:val="20"/>
+      </w:rPr>
+    </w:lvl>
+    <w:lvl w:ilvl="6" w:tentative="1">
+      <w:start w:val="1"/>
+      <w:numFmt w:val="bullet"/>
+      <w:lvlText w:val=""/>
+      <w:lvlJc w:val="left"/>
+      <w:pPr>
+        <w:tabs>
+          <w:tab w:val="num" w:pos="5040"/>
+        </w:tabs>
+        <w:ind w:left="5040" w:hanging="360"/>
+      </w:pPr>
+      <w:rPr>
+        <w:rFonts w:ascii="Wingdings" w:hAnsi="Wingdings" w:hint="default"/>
+        <w:sz w:val="20"/>
+      </w:rPr>
+    </w:lvl>
+    <w:lvl w:ilvl="7" w:tentative="1">
+      <w:start w:val="1"/>
+      <w:numFmt w:val="bullet"/>
+      <w:lvlText w:val=""/>
+      <w:lvlJc w:val="left"/>
+      <w:pPr>
+        <w:tabs>
+          <w:tab w:val="num" w:pos="5760"/>
+        </w:tabs>
+        <w:ind w:left="5760" w:hanging="360"/>
+      </w:pPr>
+      <w:rPr>
+        <w:rFonts w:ascii="Wingdings" w:hAnsi="Wingdings" w:hint="default"/>
+        <w:sz w:val="20"/>
+      </w:rPr>
+    </w:lvl>
+    <w:lvl w:ilvl="8" w:tentative="1">
+      <w:start w:val="1"/>
+      <w:numFmt w:val="bullet"/>
+      <w:lvlText w:val=""/>
+      <w:lvlJc w:val="left"/>
+      <w:pPr>
+        <w:tabs>
+          <w:tab w:val="num" w:pos="6480"/>
+        </w:tabs>
+        <w:ind w:left="6480" w:hanging="360"/>
+      </w:pPr>
+      <w:rPr>
+        <w:rFonts w:ascii="Wingdings" w:hAnsi="Wingdings" w:hint="default"/>
+        <w:sz w:val="20"/>
+      </w:rPr>
+    </w:lvl>
+  </w:abstractNum>
+  <w:abstractNum w:abstractNumId="5" w15:restartNumberingAfterBreak="0">
+    <w:nsid w:val="23534D84"/>
+    <w:multiLevelType w:val="multilevel"/>
+    <w:tmpl w:val="21703F94"/>
+    <w:lvl w:ilvl="0">
+      <w:start w:val="1"/>
+      <w:numFmt w:val="bullet"/>
+      <w:lvlText w:val=""/>
+      <w:lvlJc w:val="left"/>
+      <w:pPr>
+        <w:tabs>
+          <w:tab w:val="num" w:pos="720"/>
+        </w:tabs>
+        <w:ind w:left="720" w:hanging="360"/>
+      </w:pPr>
+      <w:rPr>
+        <w:rFonts w:ascii="Symbol" w:hAnsi="Symbol" w:hint="default"/>
+        <w:sz w:val="20"/>
+      </w:rPr>
+    </w:lvl>
+    <w:lvl w:ilvl="1" w:tentative="1">
+      <w:start w:val="1"/>
+      <w:numFmt w:val="bullet"/>
+      <w:lvlText w:val="o"/>
+      <w:lvlJc w:val="left"/>
+      <w:pPr>
+        <w:tabs>
+          <w:tab w:val="num" w:pos="1440"/>
+        </w:tabs>
+        <w:ind w:left="1440" w:hanging="360"/>
+      </w:pPr>
+      <w:rPr>
+        <w:rFonts w:ascii="Courier New" w:hAnsi="Courier New" w:hint="default"/>
+        <w:sz w:val="20"/>
+      </w:rPr>
+    </w:lvl>
+    <w:lvl w:ilvl="2" w:tentative="1">
+      <w:start w:val="1"/>
+      <w:numFmt w:val="bullet"/>
+      <w:lvlText w:val=""/>
+      <w:lvlJc w:val="left"/>
+      <w:pPr>
+        <w:tabs>
+          <w:tab w:val="num" w:pos="2160"/>
+        </w:tabs>
+        <w:ind w:left="2160" w:hanging="360"/>
+      </w:pPr>
+      <w:rPr>
+        <w:rFonts w:ascii="Wingdings" w:hAnsi="Wingdings" w:hint="default"/>
+        <w:sz w:val="20"/>
+      </w:rPr>
+    </w:lvl>
+    <w:lvl w:ilvl="3" w:tentative="1">
+      <w:start w:val="1"/>
+      <w:numFmt w:val="bullet"/>
+      <w:lvlText w:val=""/>
+      <w:lvlJc w:val="left"/>
+      <w:pPr>
+        <w:tabs>
+          <w:tab w:val="num" w:pos="2880"/>
+        </w:tabs>
+        <w:ind w:left="2880" w:hanging="360"/>
+      </w:pPr>
+      <w:rPr>
+        <w:rFonts w:ascii="Wingdings" w:hAnsi="Wingdings" w:hint="default"/>
+        <w:sz w:val="20"/>
+      </w:rPr>
+    </w:lvl>
+    <w:lvl w:ilvl="4" w:tentative="1">
+      <w:start w:val="1"/>
+      <w:numFmt w:val="bullet"/>
+      <w:lvlText w:val=""/>
+      <w:lvlJc w:val="left"/>
+      <w:pPr>
+        <w:tabs>
+          <w:tab w:val="num" w:pos="3600"/>
+        </w:tabs>
+        <w:ind w:left="3600" w:hanging="360"/>
+      </w:pPr>
+      <w:rPr>
+        <w:rFonts w:ascii="Wingdings" w:hAnsi="Wingdings" w:hint="default"/>
+        <w:sz w:val="20"/>
+      </w:rPr>
+    </w:lvl>
+    <w:lvl w:ilvl="5" w:tentative="1">
+      <w:start w:val="1"/>
+      <w:numFmt w:val="bullet"/>
+      <w:lvlText w:val=""/>
+      <w:lvlJc w:val="left"/>
+      <w:pPr>
+        <w:tabs>
+          <w:tab w:val="num" w:pos="4320"/>
+        </w:tabs>
+        <w:ind w:left="4320" w:hanging="360"/>
+      </w:pPr>
+      <w:rPr>
+        <w:rFonts w:ascii="Wingdings" w:hAnsi="Wingdings" w:hint="default"/>
+        <w:sz w:val="20"/>
+      </w:rPr>
+    </w:lvl>
+    <w:lvl w:ilvl="6" w:tentative="1">
+      <w:start w:val="1"/>
+      <w:numFmt w:val="bullet"/>
+      <w:lvlText w:val=""/>
+      <w:lvlJc w:val="left"/>
+      <w:pPr>
+        <w:tabs>
+          <w:tab w:val="num" w:pos="5040"/>
+        </w:tabs>
+        <w:ind w:left="5040" w:hanging="360"/>
+      </w:pPr>
+      <w:rPr>
+        <w:rFonts w:ascii="Wingdings" w:hAnsi="Wingdings" w:hint="default"/>
+        <w:sz w:val="20"/>
+      </w:rPr>
+    </w:lvl>
+    <w:lvl w:ilvl="7" w:tentative="1">
+      <w:start w:val="1"/>
+      <w:numFmt w:val="bullet"/>
+      <w:lvlText w:val=""/>
+      <w:lvlJc w:val="left"/>
+      <w:pPr>
+        <w:tabs>
+          <w:tab w:val="num" w:pos="5760"/>
+        </w:tabs>
+        <w:ind w:left="5760" w:hanging="360"/>
+      </w:pPr>
+      <w:rPr>
+        <w:rFonts w:ascii="Wingdings" w:hAnsi="Wingdings" w:hint="default"/>
+        <w:sz w:val="20"/>
+      </w:rPr>
+    </w:lvl>
+    <w:lvl w:ilvl="8" w:tentative="1">
+      <w:start w:val="1"/>
+      <w:numFmt w:val="bullet"/>
+      <w:lvlText w:val=""/>
+      <w:lvlJc w:val="left"/>
+      <w:pPr>
+        <w:tabs>
+          <w:tab w:val="num" w:pos="6480"/>
+        </w:tabs>
+        <w:ind w:left="6480" w:hanging="360"/>
+      </w:pPr>
+      <w:rPr>
+        <w:rFonts w:ascii="Wingdings" w:hAnsi="Wingdings" w:hint="default"/>
+        <w:sz w:val="20"/>
+      </w:rPr>
+    </w:lvl>
+  </w:abstractNum>
+  <w:abstractNum w:abstractNumId="6" w15:restartNumberingAfterBreak="0">
     <w:nsid w:val="25574188"/>
     <w:multiLevelType w:val="multilevel"/>
     <w:tmpl w:val="5CD8638C"/>
@@ -3693,7 +5084,7 @@
       </w:rPr>
     </w:lvl>
   </w:abstractNum>
-  <w:abstractNum w:abstractNumId="5" w15:restartNumberingAfterBreak="0">
+  <w:abstractNum w:abstractNumId="7" w15:restartNumberingAfterBreak="0">
     <w:nsid w:val="27C7345E"/>
     <w:multiLevelType w:val="multilevel"/>
     <w:tmpl w:val="768AFA96"/>
@@ -3842,7 +5233,7 @@
       </w:rPr>
     </w:lvl>
   </w:abstractNum>
-  <w:abstractNum w:abstractNumId="6" w15:restartNumberingAfterBreak="0">
+  <w:abstractNum w:abstractNumId="8" w15:restartNumberingAfterBreak="0">
     <w:nsid w:val="27F04FEF"/>
     <w:multiLevelType w:val="multilevel"/>
     <w:tmpl w:val="74CC1368"/>
@@ -3991,7 +5382,7 @@
       </w:rPr>
     </w:lvl>
   </w:abstractNum>
-  <w:abstractNum w:abstractNumId="7" w15:restartNumberingAfterBreak="0">
+  <w:abstractNum w:abstractNumId="9" w15:restartNumberingAfterBreak="0">
     <w:nsid w:val="2AC870A5"/>
     <w:multiLevelType w:val="multilevel"/>
     <w:tmpl w:val="618808A8"/>
@@ -4140,7 +5531,7 @@
       </w:rPr>
     </w:lvl>
   </w:abstractNum>
-  <w:abstractNum w:abstractNumId="8" w15:restartNumberingAfterBreak="0">
+  <w:abstractNum w:abstractNumId="10" w15:restartNumberingAfterBreak="0">
     <w:nsid w:val="57C913C8"/>
     <w:multiLevelType w:val="multilevel"/>
     <w:tmpl w:val="1A4297FC"/>
@@ -4289,7 +5680,269 @@
       </w:rPr>
     </w:lvl>
   </w:abstractNum>
-  <w:abstractNum w:abstractNumId="9" w15:restartNumberingAfterBreak="0">
+  <w:abstractNum w:abstractNumId="11" w15:restartNumberingAfterBreak="0">
+    <w:nsid w:val="5A083C3B"/>
+    <w:multiLevelType w:val="multilevel"/>
+    <w:tmpl w:val="DB200E4E"/>
+    <w:lvl w:ilvl="0">
+      <w:start w:val="1"/>
+      <w:numFmt w:val="bullet"/>
+      <w:lvlText w:val=""/>
+      <w:lvlJc w:val="left"/>
+      <w:pPr>
+        <w:tabs>
+          <w:tab w:val="num" w:pos="720"/>
+        </w:tabs>
+        <w:ind w:left="720" w:hanging="360"/>
+      </w:pPr>
+      <w:rPr>
+        <w:rFonts w:ascii="Symbol" w:hAnsi="Symbol" w:hint="default"/>
+        <w:sz w:val="20"/>
+      </w:rPr>
+    </w:lvl>
+    <w:lvl w:ilvl="1" w:tentative="1">
+      <w:start w:val="1"/>
+      <w:numFmt w:val="bullet"/>
+      <w:lvlText w:val="o"/>
+      <w:lvlJc w:val="left"/>
+      <w:pPr>
+        <w:tabs>
+          <w:tab w:val="num" w:pos="1440"/>
+        </w:tabs>
+        <w:ind w:left="1440" w:hanging="360"/>
+      </w:pPr>
+      <w:rPr>
+        <w:rFonts w:ascii="Courier New" w:hAnsi="Courier New" w:hint="default"/>
+        <w:sz w:val="20"/>
+      </w:rPr>
+    </w:lvl>
+    <w:lvl w:ilvl="2" w:tentative="1">
+      <w:start w:val="1"/>
+      <w:numFmt w:val="bullet"/>
+      <w:lvlText w:val=""/>
+      <w:lvlJc w:val="left"/>
+      <w:pPr>
+        <w:tabs>
+          <w:tab w:val="num" w:pos="2160"/>
+        </w:tabs>
+        <w:ind w:left="2160" w:hanging="360"/>
+      </w:pPr>
+      <w:rPr>
+        <w:rFonts w:ascii="Wingdings" w:hAnsi="Wingdings" w:hint="default"/>
+        <w:sz w:val="20"/>
+      </w:rPr>
+    </w:lvl>
+    <w:lvl w:ilvl="3" w:tentative="1">
+      <w:start w:val="1"/>
+      <w:numFmt w:val="bullet"/>
+      <w:lvlText w:val=""/>
+      <w:lvlJc w:val="left"/>
+      <w:pPr>
+        <w:tabs>
+          <w:tab w:val="num" w:pos="2880"/>
+        </w:tabs>
+        <w:ind w:left="2880" w:hanging="360"/>
+      </w:pPr>
+      <w:rPr>
+        <w:rFonts w:ascii="Wingdings" w:hAnsi="Wingdings" w:hint="default"/>
+        <w:sz w:val="20"/>
+      </w:rPr>
+    </w:lvl>
+    <w:lvl w:ilvl="4" w:tentative="1">
+      <w:start w:val="1"/>
+      <w:numFmt w:val="bullet"/>
+      <w:lvlText w:val=""/>
+      <w:lvlJc w:val="left"/>
+      <w:pPr>
+        <w:tabs>
+          <w:tab w:val="num" w:pos="3600"/>
+        </w:tabs>
+        <w:ind w:left="3600" w:hanging="360"/>
+      </w:pPr>
+      <w:rPr>
+        <w:rFonts w:ascii="Wingdings" w:hAnsi="Wingdings" w:hint="default"/>
+        <w:sz w:val="20"/>
+      </w:rPr>
+    </w:lvl>
+    <w:lvl w:ilvl="5" w:tentative="1">
+      <w:start w:val="1"/>
+      <w:numFmt w:val="bullet"/>
+      <w:lvlText w:val=""/>
+      <w:lvlJc w:val="left"/>
+      <w:pPr>
+        <w:tabs>
+          <w:tab w:val="num" w:pos="4320"/>
+        </w:tabs>
+        <w:ind w:left="4320" w:hanging="360"/>
+      </w:pPr>
+      <w:rPr>
+        <w:rFonts w:ascii="Wingdings" w:hAnsi="Wingdings" w:hint="default"/>
+        <w:sz w:val="20"/>
+      </w:rPr>
+    </w:lvl>
+    <w:lvl w:ilvl="6" w:tentative="1">
+      <w:start w:val="1"/>
+      <w:numFmt w:val="bullet"/>
+      <w:lvlText w:val=""/>
+      <w:lvlJc w:val="left"/>
+      <w:pPr>
+        <w:tabs>
+          <w:tab w:val="num" w:pos="5040"/>
+        </w:tabs>
+        <w:ind w:left="5040" w:hanging="360"/>
+      </w:pPr>
+      <w:rPr>
+        <w:rFonts w:ascii="Wingdings" w:hAnsi="Wingdings" w:hint="default"/>
+        <w:sz w:val="20"/>
+      </w:rPr>
+    </w:lvl>
+    <w:lvl w:ilvl="7" w:tentative="1">
+      <w:start w:val="1"/>
+      <w:numFmt w:val="bullet"/>
+      <w:lvlText w:val=""/>
+      <w:lvlJc w:val="left"/>
+      <w:pPr>
+        <w:tabs>
+          <w:tab w:val="num" w:pos="5760"/>
+        </w:tabs>
+        <w:ind w:left="5760" w:hanging="360"/>
+      </w:pPr>
+      <w:rPr>
+        <w:rFonts w:ascii="Wingdings" w:hAnsi="Wingdings" w:hint="default"/>
+        <w:sz w:val="20"/>
+      </w:rPr>
+    </w:lvl>
+    <w:lvl w:ilvl="8" w:tentative="1">
+      <w:start w:val="1"/>
+      <w:numFmt w:val="bullet"/>
+      <w:lvlText w:val=""/>
+      <w:lvlJc w:val="left"/>
+      <w:pPr>
+        <w:tabs>
+          <w:tab w:val="num" w:pos="6480"/>
+        </w:tabs>
+        <w:ind w:left="6480" w:hanging="360"/>
+      </w:pPr>
+      <w:rPr>
+        <w:rFonts w:ascii="Wingdings" w:hAnsi="Wingdings" w:hint="default"/>
+        <w:sz w:val="20"/>
+      </w:rPr>
+    </w:lvl>
+  </w:abstractNum>
+  <w:abstractNum w:abstractNumId="12" w15:restartNumberingAfterBreak="0">
+    <w:nsid w:val="64D870AC"/>
+    <w:multiLevelType w:val="multilevel"/>
+    <w:tmpl w:val="9C724632"/>
+    <w:lvl w:ilvl="0">
+      <w:start w:val="1"/>
+      <w:numFmt w:val="decimal"/>
+      <w:lvlText w:val="%1."/>
+      <w:lvlJc w:val="left"/>
+      <w:pPr>
+        <w:tabs>
+          <w:tab w:val="num" w:pos="720"/>
+        </w:tabs>
+        <w:ind w:left="720" w:hanging="360"/>
+      </w:pPr>
+    </w:lvl>
+    <w:lvl w:ilvl="1" w:tentative="1">
+      <w:start w:val="1"/>
+      <w:numFmt w:val="decimal"/>
+      <w:lvlText w:val="%2."/>
+      <w:lvlJc w:val="left"/>
+      <w:pPr>
+        <w:tabs>
+          <w:tab w:val="num" w:pos="1440"/>
+        </w:tabs>
+        <w:ind w:left="1440" w:hanging="360"/>
+      </w:pPr>
+    </w:lvl>
+    <w:lvl w:ilvl="2" w:tentative="1">
+      <w:start w:val="1"/>
+      <w:numFmt w:val="decimal"/>
+      <w:lvlText w:val="%3."/>
+      <w:lvlJc w:val="left"/>
+      <w:pPr>
+        <w:tabs>
+          <w:tab w:val="num" w:pos="2160"/>
+        </w:tabs>
+        <w:ind w:left="2160" w:hanging="360"/>
+      </w:pPr>
+    </w:lvl>
+    <w:lvl w:ilvl="3" w:tentative="1">
+      <w:start w:val="1"/>
+      <w:numFmt w:val="decimal"/>
+      <w:lvlText w:val="%4."/>
+      <w:lvlJc w:val="left"/>
+      <w:pPr>
+        <w:tabs>
+          <w:tab w:val="num" w:pos="2880"/>
+        </w:tabs>
+        <w:ind w:left="2880" w:hanging="360"/>
+      </w:pPr>
+    </w:lvl>
+    <w:lvl w:ilvl="4" w:tentative="1">
+      <w:start w:val="1"/>
+      <w:numFmt w:val="decimal"/>
+      <w:lvlText w:val="%5."/>
+      <w:lvlJc w:val="left"/>
+      <w:pPr>
+        <w:tabs>
+          <w:tab w:val="num" w:pos="3600"/>
+        </w:tabs>
+        <w:ind w:left="3600" w:hanging="360"/>
+      </w:pPr>
+    </w:lvl>
+    <w:lvl w:ilvl="5" w:tentative="1">
+      <w:start w:val="1"/>
+      <w:numFmt w:val="decimal"/>
+      <w:lvlText w:val="%6."/>
+      <w:lvlJc w:val="left"/>
+      <w:pPr>
+        <w:tabs>
+          <w:tab w:val="num" w:pos="4320"/>
+        </w:tabs>
+        <w:ind w:left="4320" w:hanging="360"/>
+      </w:pPr>
+    </w:lvl>
+    <w:lvl w:ilvl="6" w:tentative="1">
+      <w:start w:val="1"/>
+      <w:numFmt w:val="decimal"/>
+      <w:lvlText w:val="%7."/>
+      <w:lvlJc w:val="left"/>
+      <w:pPr>
+        <w:tabs>
+          <w:tab w:val="num" w:pos="5040"/>
+        </w:tabs>
+        <w:ind w:left="5040" w:hanging="360"/>
+      </w:pPr>
+    </w:lvl>
+    <w:lvl w:ilvl="7" w:tentative="1">
+      <w:start w:val="1"/>
+      <w:numFmt w:val="decimal"/>
+      <w:lvlText w:val="%8."/>
+      <w:lvlJc w:val="left"/>
+      <w:pPr>
+        <w:tabs>
+          <w:tab w:val="num" w:pos="5760"/>
+        </w:tabs>
+        <w:ind w:left="5760" w:hanging="360"/>
+      </w:pPr>
+    </w:lvl>
+    <w:lvl w:ilvl="8" w:tentative="1">
+      <w:start w:val="1"/>
+      <w:numFmt w:val="decimal"/>
+      <w:lvlText w:val="%9."/>
+      <w:lvlJc w:val="left"/>
+      <w:pPr>
+        <w:tabs>
+          <w:tab w:val="num" w:pos="6480"/>
+        </w:tabs>
+        <w:ind w:left="6480" w:hanging="360"/>
+      </w:pPr>
+    </w:lvl>
+  </w:abstractNum>
+  <w:abstractNum w:abstractNumId="13" w15:restartNumberingAfterBreak="0">
     <w:nsid w:val="695F2603"/>
     <w:multiLevelType w:val="multilevel"/>
     <w:tmpl w:val="F2C29350"/>
@@ -4438,7 +6091,156 @@
       </w:rPr>
     </w:lvl>
   </w:abstractNum>
-  <w:abstractNum w:abstractNumId="10" w15:restartNumberingAfterBreak="0">
+  <w:abstractNum w:abstractNumId="14" w15:restartNumberingAfterBreak="0">
+    <w:nsid w:val="70E84367"/>
+    <w:multiLevelType w:val="multilevel"/>
+    <w:tmpl w:val="0AEEBA42"/>
+    <w:lvl w:ilvl="0">
+      <w:start w:val="1"/>
+      <w:numFmt w:val="bullet"/>
+      <w:lvlText w:val=""/>
+      <w:lvlJc w:val="left"/>
+      <w:pPr>
+        <w:tabs>
+          <w:tab w:val="num" w:pos="720"/>
+        </w:tabs>
+        <w:ind w:left="720" w:hanging="360"/>
+      </w:pPr>
+      <w:rPr>
+        <w:rFonts w:ascii="Symbol" w:hAnsi="Symbol" w:hint="default"/>
+        <w:sz w:val="20"/>
+      </w:rPr>
+    </w:lvl>
+    <w:lvl w:ilvl="1" w:tentative="1">
+      <w:start w:val="1"/>
+      <w:numFmt w:val="bullet"/>
+      <w:lvlText w:val="o"/>
+      <w:lvlJc w:val="left"/>
+      <w:pPr>
+        <w:tabs>
+          <w:tab w:val="num" w:pos="1440"/>
+        </w:tabs>
+        <w:ind w:left="1440" w:hanging="360"/>
+      </w:pPr>
+      <w:rPr>
+        <w:rFonts w:ascii="Courier New" w:hAnsi="Courier New" w:hint="default"/>
+        <w:sz w:val="20"/>
+      </w:rPr>
+    </w:lvl>
+    <w:lvl w:ilvl="2" w:tentative="1">
+      <w:start w:val="1"/>
+      <w:numFmt w:val="bullet"/>
+      <w:lvlText w:val=""/>
+      <w:lvlJc w:val="left"/>
+      <w:pPr>
+        <w:tabs>
+          <w:tab w:val="num" w:pos="2160"/>
+        </w:tabs>
+        <w:ind w:left="2160" w:hanging="360"/>
+      </w:pPr>
+      <w:rPr>
+        <w:rFonts w:ascii="Wingdings" w:hAnsi="Wingdings" w:hint="default"/>
+        <w:sz w:val="20"/>
+      </w:rPr>
+    </w:lvl>
+    <w:lvl w:ilvl="3" w:tentative="1">
+      <w:start w:val="1"/>
+      <w:numFmt w:val="bullet"/>
+      <w:lvlText w:val=""/>
+      <w:lvlJc w:val="left"/>
+      <w:pPr>
+        <w:tabs>
+          <w:tab w:val="num" w:pos="2880"/>
+        </w:tabs>
+        <w:ind w:left="2880" w:hanging="360"/>
+      </w:pPr>
+      <w:rPr>
+        <w:rFonts w:ascii="Wingdings" w:hAnsi="Wingdings" w:hint="default"/>
+        <w:sz w:val="20"/>
+      </w:rPr>
+    </w:lvl>
+    <w:lvl w:ilvl="4" w:tentative="1">
+      <w:start w:val="1"/>
+      <w:numFmt w:val="bullet"/>
+      <w:lvlText w:val=""/>
+      <w:lvlJc w:val="left"/>
+      <w:pPr>
+        <w:tabs>
+          <w:tab w:val="num" w:pos="3600"/>
+        </w:tabs>
+        <w:ind w:left="3600" w:hanging="360"/>
+      </w:pPr>
+      <w:rPr>
+        <w:rFonts w:ascii="Wingdings" w:hAnsi="Wingdings" w:hint="default"/>
+        <w:sz w:val="20"/>
+      </w:rPr>
+    </w:lvl>
+    <w:lvl w:ilvl="5" w:tentative="1">
+      <w:start w:val="1"/>
+      <w:numFmt w:val="bullet"/>
+      <w:lvlText w:val=""/>
+      <w:lvlJc w:val="left"/>
+      <w:pPr>
+        <w:tabs>
+          <w:tab w:val="num" w:pos="4320"/>
+        </w:tabs>
+        <w:ind w:left="4320" w:hanging="360"/>
+      </w:pPr>
+      <w:rPr>
+        <w:rFonts w:ascii="Wingdings" w:hAnsi="Wingdings" w:hint="default"/>
+        <w:sz w:val="20"/>
+      </w:rPr>
+    </w:lvl>
+    <w:lvl w:ilvl="6" w:tentative="1">
+      <w:start w:val="1"/>
+      <w:numFmt w:val="bullet"/>
+      <w:lvlText w:val=""/>
+      <w:lvlJc w:val="left"/>
+      <w:pPr>
+        <w:tabs>
+          <w:tab w:val="num" w:pos="5040"/>
+        </w:tabs>
+        <w:ind w:left="5040" w:hanging="360"/>
+      </w:pPr>
+      <w:rPr>
+        <w:rFonts w:ascii="Wingdings" w:hAnsi="Wingdings" w:hint="default"/>
+        <w:sz w:val="20"/>
+      </w:rPr>
+    </w:lvl>
+    <w:lvl w:ilvl="7" w:tentative="1">
+      <w:start w:val="1"/>
+      <w:numFmt w:val="bullet"/>
+      <w:lvlText w:val=""/>
+      <w:lvlJc w:val="left"/>
+      <w:pPr>
+        <w:tabs>
+          <w:tab w:val="num" w:pos="5760"/>
+        </w:tabs>
+        <w:ind w:left="5760" w:hanging="360"/>
+      </w:pPr>
+      <w:rPr>
+        <w:rFonts w:ascii="Wingdings" w:hAnsi="Wingdings" w:hint="default"/>
+        <w:sz w:val="20"/>
+      </w:rPr>
+    </w:lvl>
+    <w:lvl w:ilvl="8" w:tentative="1">
+      <w:start w:val="1"/>
+      <w:numFmt w:val="bullet"/>
+      <w:lvlText w:val=""/>
+      <w:lvlJc w:val="left"/>
+      <w:pPr>
+        <w:tabs>
+          <w:tab w:val="num" w:pos="6480"/>
+        </w:tabs>
+        <w:ind w:left="6480" w:hanging="360"/>
+      </w:pPr>
+      <w:rPr>
+        <w:rFonts w:ascii="Wingdings" w:hAnsi="Wingdings" w:hint="default"/>
+        <w:sz w:val="20"/>
+      </w:rPr>
+    </w:lvl>
+  </w:abstractNum>
+  <w:abstractNum w:abstractNumId="15" w15:restartNumberingAfterBreak="0">
     <w:nsid w:val="71481F5F"/>
     <w:multiLevelType w:val="multilevel"/>
     <w:tmpl w:val="62A6F400"/>
@@ -4587,7 +6389,7 @@
       </w:rPr>
     </w:lvl>
   </w:abstractNum>
-  <w:abstractNum w:abstractNumId="11" w15:restartNumberingAfterBreak="0">
+  <w:abstractNum w:abstractNumId="16" w15:restartNumberingAfterBreak="0">
     <w:nsid w:val="75F17399"/>
     <w:multiLevelType w:val="multilevel"/>
     <w:tmpl w:val="00703E0E"/>
@@ -4736,7 +6538,120 @@
       </w:rPr>
     </w:lvl>
   </w:abstractNum>
-  <w:abstractNum w:abstractNumId="12" w15:restartNumberingAfterBreak="0">
+  <w:abstractNum w:abstractNumId="17" w15:restartNumberingAfterBreak="0">
+    <w:nsid w:val="7ED04767"/>
+    <w:multiLevelType w:val="multilevel"/>
+    <w:tmpl w:val="20363086"/>
+    <w:lvl w:ilvl="0">
+      <w:start w:val="1"/>
+      <w:numFmt w:val="decimal"/>
+      <w:lvlText w:val="%1."/>
+      <w:lvlJc w:val="left"/>
+      <w:pPr>
+        <w:tabs>
+          <w:tab w:val="num" w:pos="720"/>
+        </w:tabs>
+        <w:ind w:left="720" w:hanging="360"/>
+      </w:pPr>
+    </w:lvl>
+    <w:lvl w:ilvl="1" w:tentative="1">
+      <w:start w:val="1"/>
+      <w:numFmt w:val="decimal"/>
+      <w:lvlText w:val="%2."/>
+      <w:lvlJc w:val="left"/>
+      <w:pPr>
+        <w:tabs>
+          <w:tab w:val="num" w:pos="1440"/>
+        </w:tabs>
+        <w:ind w:left="1440" w:hanging="360"/>
+      </w:pPr>
+    </w:lvl>
+    <w:lvl w:ilvl="2" w:tentative="1">
+      <w:start w:val="1"/>
+      <w:numFmt w:val="decimal"/>
+      <w:lvlText w:val="%3."/>
+      <w:lvlJc w:val="left"/>
+      <w:pPr>
+        <w:tabs>
+          <w:tab w:val="num" w:pos="2160"/>
+        </w:tabs>
+        <w:ind w:left="2160" w:hanging="360"/>
+      </w:pPr>
+    </w:lvl>
+    <w:lvl w:ilvl="3" w:tentative="1">
+      <w:start w:val="1"/>
+      <w:numFmt w:val="decimal"/>
+      <w:lvlText w:val="%4."/>
+      <w:lvlJc w:val="left"/>
+      <w:pPr>
+        <w:tabs>
+          <w:tab w:val="num" w:pos="2880"/>
+        </w:tabs>
+        <w:ind w:left="2880" w:hanging="360"/>
+      </w:pPr>
+    </w:lvl>
+    <w:lvl w:ilvl="4" w:tentative="1">
+      <w:start w:val="1"/>
+      <w:numFmt w:val="decimal"/>
+      <w:lvlText w:val="%5."/>
+      <w:lvlJc w:val="left"/>
+      <w:pPr>
+        <w:tabs>
+          <w:tab w:val="num" w:pos="3600"/>
+        </w:tabs>
+        <w:ind w:left="3600" w:hanging="360"/>
+      </w:pPr>
+    </w:lvl>
+    <w:lvl w:ilvl="5" w:tentative="1">
+      <w:start w:val="1"/>
+      <w:numFmt w:val="decimal"/>
+      <w:lvlText w:val="%6."/>
+      <w:lvlJc w:val="left"/>
+      <w:pPr>
+        <w:tabs>
+          <w:tab w:val="num" w:pos="4320"/>
+        </w:tabs>
+        <w:ind w:left="4320" w:hanging="360"/>
+      </w:pPr>
+    </w:lvl>
+    <w:lvl w:ilvl="6" w:tentative="1">
+      <w:start w:val="1"/>
+      <w:numFmt w:val="decimal"/>
+      <w:lvlText w:val="%7."/>
+      <w:lvlJc w:val="left"/>
+      <w:pPr>
+        <w:tabs>
+          <w:tab w:val="num" w:pos="5040"/>
+        </w:tabs>
+        <w:ind w:left="5040" w:hanging="360"/>
+      </w:pPr>
+    </w:lvl>
+    <w:lvl w:ilvl="7" w:tentative="1">
+      <w:start w:val="1"/>
+      <w:numFmt w:val="decimal"/>
+      <w:lvlText w:val="%8."/>
+      <w:lvlJc w:val="left"/>
+      <w:pPr>
+        <w:tabs>
+          <w:tab w:val="num" w:pos="5760"/>
+        </w:tabs>
+        <w:ind w:left="5760" w:hanging="360"/>
+      </w:pPr>
+    </w:lvl>
+    <w:lvl w:ilvl="8" w:tentative="1">
+      <w:start w:val="1"/>
+      <w:numFmt w:val="decimal"/>
+      <w:lvlText w:val="%9."/>
+      <w:lvlJc w:val="left"/>
+      <w:pPr>
+        <w:tabs>
+          <w:tab w:val="num" w:pos="6480"/>
+        </w:tabs>
+        <w:ind w:left="6480" w:hanging="360"/>
+      </w:pPr>
+    </w:lvl>
+  </w:abstractNum>
+  <w:abstractNum w:abstractNumId="18" w15:restartNumberingAfterBreak="0">
     <w:nsid w:val="7F7746D7"/>
     <w:multiLevelType w:val="multilevel"/>
     <w:tmpl w:val="F14CA974"/>
@@ -4886,43 +6801,61 @@
     </w:lvl>
   </w:abstractNum>
   <w:num w:numId="1">
-    <w:abstractNumId w:val="8"/>
+    <w:abstractNumId w:val="10"/>
   </w:num>
   <w:num w:numId="2">
     <w:abstractNumId w:val="0"/>
   </w:num>
   <w:num w:numId="3">
-    <w:abstractNumId w:val="10"/>
+    <w:abstractNumId w:val="15"/>
   </w:num>
   <w:num w:numId="4">
-    <w:abstractNumId w:val="4"/>
+    <w:abstractNumId w:val="6"/>
   </w:num>
   <w:num w:numId="5">
-    <w:abstractNumId w:val="7"/>
+    <w:abstractNumId w:val="9"/>
   </w:num>
   <w:num w:numId="6">
-    <w:abstractNumId w:val="6"/>
+    <w:abstractNumId w:val="8"/>
   </w:num>
   <w:num w:numId="7">
-    <w:abstractNumId w:val="11"/>
+    <w:abstractNumId w:val="16"/>
   </w:num>
   <w:num w:numId="8">
     <w:abstractNumId w:val="2"/>
   </w:num>
   <w:num w:numId="9">
-    <w:abstractNumId w:val="12"/>
+    <w:abstractNumId w:val="18"/>
   </w:num>
   <w:num w:numId="10">
     <w:abstractNumId w:val="3"/>
   </w:num>
   <w:num w:numId="11">
-    <w:abstractNumId w:val="5"/>
+    <w:abstractNumId w:val="7"/>
   </w:num>
   <w:num w:numId="12">
-    <w:abstractNumId w:val="9"/>
+    <w:abstractNumId w:val="13"/>
   </w:num>
   <w:num w:numId="13">
     <w:abstractNumId w:val="1"/>
+  </w:num>
+  <w:num w:numId="14">
+    <w:abstractNumId w:val="14"/>
+  </w:num>
+  <w:num w:numId="15">
+    <w:abstractNumId w:val="17"/>
+  </w:num>
+  <w:num w:numId="16">
+    <w:abstractNumId w:val="12"/>
+  </w:num>
+  <w:num w:numId="17">
+    <w:abstractNumId w:val="4"/>
+  </w:num>
+  <w:num w:numId="18">
+    <w:abstractNumId w:val="11"/>
+  </w:num>
+  <w:num w:numId="19">
+    <w:abstractNumId w:val="5"/>
   </w:num>
 </w:numbering>
 </file>
@@ -5367,6 +7300,29 @@
       <w:lang w:eastAsia="fr-FR"/>
     </w:rPr>
   </w:style>
+  <w:style w:type="paragraph" w:styleId="Heading3">
+    <w:name w:val="heading 3"/>
+    <w:basedOn w:val="Normal"/>
+    <w:next w:val="Normal"/>
+    <w:link w:val="Heading3Char"/>
+    <w:uiPriority w:val="9"/>
+    <w:semiHidden/>
+    <w:unhideWhenUsed/>
+    <w:qFormat/>
+    <w:rsid w:val="0043148D"/>
+    <w:pPr>
+      <w:keepNext/>
+      <w:keepLines/>
+      <w:spacing w:before="40" w:after="0"/>
+      <w:outlineLvl w:val="2"/>
+    </w:pPr>
+    <w:rPr>
+      <w:rFonts w:asciiTheme="majorHAnsi" w:eastAsiaTheme="majorEastAsia" w:hAnsiTheme="majorHAnsi" w:cstheme="majorBidi"/>
+      <w:color w:val="1F3763" w:themeColor="accent1" w:themeShade="7F"/>
+      <w:sz w:val="24"/>
+      <w:szCs w:val="24"/>
+    </w:rPr>
+  </w:style>
   <w:style w:type="character" w:default="1" w:styleId="DefaultParagraphFont">
     <w:name w:val="Default Paragraph Font"/>
     <w:uiPriority w:val="1"/>
@@ -5453,6 +7409,42 @@
       <w:sz w:val="24"/>
       <w:szCs w:val="24"/>
       <w:lang w:eastAsia="fr-FR"/>
+    </w:rPr>
+  </w:style>
+  <w:style w:type="character" w:customStyle="1" w:styleId="Heading3Char">
+    <w:name w:val="Heading 3 Char"/>
+    <w:basedOn w:val="DefaultParagraphFont"/>
+    <w:link w:val="Heading3"/>
+    <w:uiPriority w:val="9"/>
+    <w:semiHidden/>
+    <w:rsid w:val="0043148D"/>
+    <w:rPr>
+      <w:rFonts w:asciiTheme="majorHAnsi" w:eastAsiaTheme="majorEastAsia" w:hAnsiTheme="majorHAnsi" w:cstheme="majorBidi"/>
+      <w:color w:val="1F3763" w:themeColor="accent1" w:themeShade="7F"/>
+      <w:sz w:val="24"/>
+      <w:szCs w:val="24"/>
+    </w:rPr>
+  </w:style>
+  <w:style w:type="character" w:styleId="Strong">
+    <w:name w:val="Strong"/>
+    <w:basedOn w:val="DefaultParagraphFont"/>
+    <w:uiPriority w:val="22"/>
+    <w:qFormat/>
+    <w:rsid w:val="0043148D"/>
+    <w:rPr>
+      <w:b/>
+      <w:bCs/>
+    </w:rPr>
+  </w:style>
+  <w:style w:type="character" w:styleId="Emphasis">
+    <w:name w:val="Emphasis"/>
+    <w:basedOn w:val="DefaultParagraphFont"/>
+    <w:uiPriority w:val="20"/>
+    <w:qFormat/>
+    <w:rsid w:val="0043148D"/>
+    <w:rPr>
+      <w:i/>
+      <w:iCs/>
     </w:rPr>
   </w:style>
 </w:styles>

</xml_diff>